<commit_message>
2026-07-24b: add Hero SKU Matrix page; update User Guide with 2-page structure
</commit_message>
<xml_diff>
--- a/docs/User_Guide.docx
+++ b/docs/User_Guide.docx
@@ -20,12 +20,37 @@
     </w:p>
     <w:p>
       <w:r>
-        <w:t>一个网页看板，按季度月历展示各竞品品牌的新备案/注册产品（成分、功效宣称、Artwork PDF、功效证明、产品图）。</w:t>
+        <w:t>一个网页看板，包含两个页面：</w:t>
       </w:r>
     </w:p>
     <w:p>
+      <w:pPr>
+        <w:pStyle w:val="ListNumber"/>
+      </w:pPr>
+      <w:r/>
       <w:r>
-        <w:t>A web dashboard showing competitor brands' newly filed/registered products by quarter (ingredients, benefit claims, artwork PDF, proof-of-claim, product image).</w:t>
+        <w:rPr>
+          <w:b/>
+        </w:rPr>
+        <w:t>新品月历（主页）</w:t>
+      </w:r>
+      <w:r>
+        <w:t>：按季度月历展示各竞品品牌的新备案/注册产品（成分、功效宣称、PDF、产品图）</w:t>
+      </w:r>
+    </w:p>
+    <w:p>
+      <w:pPr>
+        <w:pStyle w:val="ListNumber"/>
+      </w:pPr>
+      <w:r/>
+      <w:r>
+        <w:rPr>
+          <w:b/>
+        </w:rPr>
+        <w:t>🏆 Hero SKU Matrix</w:t>
+      </w:r>
+      <w:r>
+        <w:t>：品牌 × 系列 × 护肤步骤的明星单品全景矩阵</w:t>
       </w:r>
     </w:p>
     <w:p>
@@ -97,8 +122,26 @@
       </w:r>
     </w:p>
     <w:p>
+      <w:r>
+        <w:t>左侧边栏可切换页面。</w:t>
+      </w:r>
+    </w:p>
+    <w:p>
+      <w:r>
+        <w:t>───────────────────────────────────────────────────────</w:t>
+      </w:r>
+    </w:p>
+    <w:p>
       <w:pPr>
         <w:pStyle w:val="Heading2"/>
+      </w:pPr>
+      <w:r>
+        <w:t>页面1：新品月历 New SKU Calendar（主页）</w:t>
+      </w:r>
+    </w:p>
+    <w:p>
+      <w:pPr>
+        <w:pStyle w:val="Heading3"/>
       </w:pPr>
       <w:r>
         <w:t>筛选栏 Filters (top of page)</w:t>
@@ -387,7 +430,7 @@
     </w:tbl>
     <w:p>
       <w:pPr>
-        <w:pStyle w:val="Heading2"/>
+        <w:pStyle w:val="Heading3"/>
       </w:pPr>
       <w:r>
         <w:t>统计卡片 Summary cards</w:t>
@@ -465,7 +508,7 @@
     </w:p>
     <w:p>
       <w:pPr>
-        <w:pStyle w:val="Heading2"/>
+        <w:pStyle w:val="Heading3"/>
       </w:pPr>
       <w:r>
         <w:t>看懂卡片 Reading a product card</w:t>
@@ -547,7 +590,7 @@
     </w:p>
     <w:p>
       <w:pPr>
-        <w:pStyle w:val="Heading2"/>
+        <w:pStyle w:val="Heading3"/>
       </w:pPr>
       <w:r>
         <w:t>成分对比 Comparing ingredients</w:t>
@@ -574,7 +617,7 @@
     </w:p>
     <w:p>
       <w:pPr>
-        <w:pStyle w:val="Heading2"/>
+        <w:pStyle w:val="Heading3"/>
       </w:pPr>
       <w:r>
         <w:t>下载 PDF Downloading PDFs</w:t>
@@ -586,13 +629,8 @@
       </w:r>
     </w:p>
     <w:p>
-      <w:r>
-        <w:t>Use the "PDF Download" section further down the page to download locally cached PDFs directly (useful if the external NMPA link is blocked on the company network).</w:t>
-      </w:r>
-    </w:p>
-    <w:p>
       <w:pPr>
-        <w:pStyle w:val="Heading2"/>
+        <w:pStyle w:val="Heading3"/>
       </w:pPr>
       <w:r>
         <w:t>原始数据 Raw data</w:t>
@@ -605,7 +643,104 @@
     </w:p>
     <w:p>
       <w:r>
-        <w:t>Expand "📊 原始数据" at the bottom to see the full data as a table.</w:t>
+        <w:t>───────────────────────────────────────────────────────</w:t>
+      </w:r>
+    </w:p>
+    <w:p>
+      <w:pPr>
+        <w:pStyle w:val="Heading2"/>
+      </w:pPr>
+      <w:r>
+        <w:t>页面2：🏆 Hero SKU Matrix</w:t>
+      </w:r>
+    </w:p>
+    <w:p>
+      <w:r>
+        <w:t>品牌旗下各系列在不同护肤步骤上的明星单品全景视图。</w:t>
+      </w:r>
+    </w:p>
+    <w:p>
+      <w:pPr>
+        <w:pStyle w:val="Heading3"/>
+      </w:pPr>
+      <w:r>
+        <w:t>矩阵结构</w:t>
+      </w:r>
+    </w:p>
+    <w:p>
+      <w:pPr>
+        <w:pStyle w:val="ListBullet"/>
+      </w:pPr>
+      <w:r/>
+      <w:r>
+        <w:rPr>
+          <w:b/>
+        </w:rPr>
+        <w:t>行</w:t>
+      </w:r>
+      <w:r>
+        <w:t>：品牌 × 系列（如 珀莱雅 - 红宝石系列）</w:t>
+      </w:r>
+    </w:p>
+    <w:p>
+      <w:pPr>
+        <w:pStyle w:val="ListBullet"/>
+      </w:pPr>
+      <w:r/>
+      <w:r>
+        <w:rPr>
+          <w:b/>
+        </w:rPr>
+        <w:t>列</w:t>
+      </w:r>
+      <w:r>
+        <w:t>：15个护肤步骤（洁面 → 水 → 精华 → 霜 → 眼霜 → 面膜 → 防晒 → 其他）</w:t>
+      </w:r>
+    </w:p>
+    <w:p>
+      <w:pPr>
+        <w:pStyle w:val="ListBullet"/>
+      </w:pPr>
+      <w:r/>
+      <w:r>
+        <w:rPr>
+          <w:b/>
+        </w:rPr>
+        <w:t>格内</w:t>
+      </w:r>
+      <w:r>
+        <w:t>：该系列在该步骤的明星单品名称和价格</w:t>
+      </w:r>
+    </w:p>
+    <w:p>
+      <w:pPr>
+        <w:pStyle w:val="Heading3"/>
+      </w:pPr>
+      <w:r>
+        <w:t>筛选方式</w:t>
+      </w:r>
+    </w:p>
+    <w:p>
+      <w:r>
+        <w:t>左侧边栏可选择要对比的品牌（可多选，默认显示前3个）。</w:t>
+      </w:r>
+    </w:p>
+    <w:p>
+      <w:pPr>
+        <w:pStyle w:val="Heading3"/>
+      </w:pPr>
+      <w:r>
+        <w:t>覆盖品牌</w:t>
+      </w:r>
+    </w:p>
+    <w:p>
+      <w:r>
+        <w:t>珀莱雅、欧莱雅、雅诗兰黛、科颜氏、修丽可、谷雨、欧诗漫、兰蔻。</w:t>
+      </w:r>
+    </w:p>
+    <w:p>
+      <w:r>
+        <w:t>───────────────────────────────────────────────────────</w:t>
       </w:r>
     </w:p>
     <w:p>

</xml_diff>